<commit_message>
He quitado el CIF de la lista de clientes
</commit_message>
<xml_diff>
--- a/documentación/Crear una nueva BD y ponerla en marcha.docx
+++ b/documentación/Crear una nueva BD y ponerla en marcha.docx
@@ -10,7 +10,13 @@
     <w:p/>
     <w:p>
       <w:r>
-        <w:t>Añadir un usuario :</w:t>
+        <w:t>Añadir un usuario</w:t>
+      </w:r>
+      <w:r>
+        <w:t>s</w:t>
+      </w:r>
+      <w:r>
+        <w:t>:</w:t>
       </w:r>
     </w:p>
     <w:p>
@@ -32,19 +38,129 @@
       </w:r>
     </w:p>
     <w:p/>
+    <w:p>
+      <w:r>
+        <w:t xml:space="preserve">User: </w:t>
+      </w:r>
+      <w:hyperlink r:id="rId5" w:history="1">
+        <w:r>
+          <w:rPr>
+            <w:rStyle w:val="Hipervnculo"/>
+          </w:rPr>
+          <w:t>ineterno</w:t>
+        </w:r>
+        <w:r>
+          <w:rPr>
+            <w:rStyle w:val="Hipervnculo"/>
+          </w:rPr>
+          <w:t>@promocima.com</w:t>
+        </w:r>
+      </w:hyperlink>
+    </w:p>
+    <w:p>
+      <w:r>
+        <w:t>pass: Promocima</w:t>
+      </w:r>
+    </w:p>
     <w:p/>
     <w:p>
       <w:r>
+        <w:t xml:space="preserve">User: </w:t>
+      </w:r>
+      <w:hyperlink r:id="rId6" w:history="1">
+        <w:r>
+          <w:rPr>
+            <w:rStyle w:val="Hipervnculo"/>
+          </w:rPr>
+          <w:t>perticipe</w:t>
+        </w:r>
+        <w:r>
+          <w:rPr>
+            <w:rStyle w:val="Hipervnculo"/>
+          </w:rPr>
+          <w:t>@promocima.com</w:t>
+        </w:r>
+      </w:hyperlink>
+    </w:p>
+    <w:p>
+      <w:r>
+        <w:t>pass: Promocima</w:t>
+      </w:r>
+    </w:p>
+    <w:p/>
+    <w:p>
+      <w:r>
+        <w:t xml:space="preserve">User: </w:t>
+      </w:r>
+      <w:r>
+        <w:t>t_</w:t>
+      </w:r>
+      <w:hyperlink r:id="rId7" w:history="1">
+        <w:r>
+          <w:rPr>
+            <w:rStyle w:val="Hipervnculo"/>
+          </w:rPr>
+          <w:t>admin@promocima.com</w:t>
+        </w:r>
+      </w:hyperlink>
+    </w:p>
+    <w:p>
+      <w:r>
+        <w:t>pass: Promocima</w:t>
+      </w:r>
+    </w:p>
+    <w:p/>
+    <w:p>
+      <w:r>
+        <w:t xml:space="preserve">User: </w:t>
+      </w:r>
+      <w:r>
+        <w:t>t_</w:t>
+      </w:r>
+      <w:hyperlink r:id="rId8" w:history="1">
+        <w:r>
+          <w:rPr>
+            <w:rStyle w:val="Hipervnculo"/>
+          </w:rPr>
+          <w:t>ineterno@promocima.com</w:t>
+        </w:r>
+      </w:hyperlink>
+    </w:p>
+    <w:p>
+      <w:r>
+        <w:t>pass: Promocima</w:t>
+      </w:r>
+    </w:p>
+    <w:p/>
+    <w:p>
+      <w:r>
+        <w:t xml:space="preserve">User: </w:t>
+      </w:r>
+      <w:r>
+        <w:t>t_</w:t>
+      </w:r>
+      <w:hyperlink r:id="rId9" w:history="1">
+        <w:r>
+          <w:rPr>
+            <w:rStyle w:val="Hipervnculo"/>
+          </w:rPr>
+          <w:t>perticipe@promocima.com</w:t>
+        </w:r>
+      </w:hyperlink>
+    </w:p>
+    <w:p>
+      <w:r>
+        <w:t>pass: Promocima</w:t>
+      </w:r>
+    </w:p>
+    <w:p/>
+    <w:p/>
+    <w:p>
+      <w:r>
         <w:t>Ejecutar la siguiente query para crear un perfil:</w:t>
       </w:r>
     </w:p>
-    <w:p>
-      <w:pPr>
-        <w:rPr>
-          <w:lang w:val="en-US"/>
-        </w:rPr>
-      </w:pPr>
-    </w:p>
+    <w:p/>
     <w:p>
       <w:r>
         <w:t>-- 1. Crear empresa</w:t>
@@ -76,17 +192,12 @@
       <w:r>
         <w:t>-- 2. Crear perfil</w:t>
       </w:r>
-    </w:p>
-    <w:p>
-      <w:pPr>
-        <w:rPr>
-          <w:lang w:val="en-US"/>
-        </w:rPr>
-      </w:pPr>
-      <w:r>
-        <w:rPr>
-          <w:lang w:val="en-US"/>
-        </w:rPr>
+      <w:r>
+        <w:t>es</w:t>
+      </w:r>
+    </w:p>
+    <w:p>
+      <w:r>
         <w:t>INSERT INTO public.perfiles (id, email, nombre, rol, activo, created_at, participe_ids, empresa_id)</w:t>
       </w:r>
     </w:p>
@@ -97,7 +208,16 @@
     </w:p>
     <w:p>
       <w:r>
-        <w:t xml:space="preserve">  '4c4bb92e-f5e0-497e-9891-9dfacfb55199',</w:t>
+        <w:t xml:space="preserve">  '</w:t>
+      </w:r>
+      <w:r>
+        <w:t>id_user_admin</w:t>
+      </w:r>
+      <w:r>
+        <w:t>'</w:t>
+      </w:r>
+      <w:r>
+        <w:t>,</w:t>
       </w:r>
     </w:p>
     <w:p>
@@ -220,6 +340,783 @@
           <w:lang w:val="en-US"/>
         </w:rPr>
       </w:pPr>
+      <w:r>
+        <w:rPr>
+          <w:lang w:val="en-US"/>
+        </w:rPr>
+        <w:t>INSERT INTO public.perfiles (id, email, nombre, rol, activo, created_at, participe_ids, empresa_id)</w:t>
+      </w:r>
+    </w:p>
+    <w:p>
+      <w:pPr>
+        <w:rPr>
+          <w:lang w:val="en-US"/>
+        </w:rPr>
+      </w:pPr>
+      <w:r>
+        <w:rPr>
+          <w:lang w:val="en-US"/>
+        </w:rPr>
+        <w:lastRenderedPageBreak/>
+        <w:t>VALUES (</w:t>
+      </w:r>
+    </w:p>
+    <w:p>
+      <w:r>
+        <w:t xml:space="preserve">  '</w:t>
+      </w:r>
+      <w:r>
+        <w:t>id_user_</w:t>
+      </w:r>
+      <w:r>
+        <w:t>interno</w:t>
+      </w:r>
+      <w:r>
+        <w:t>',</w:t>
+      </w:r>
+    </w:p>
+    <w:p>
+      <w:r>
+        <w:t xml:space="preserve">  '</w:t>
+      </w:r>
+      <w:r>
+        <w:t>interno</w:t>
+      </w:r>
+      <w:r>
+        <w:t>@promocima.com',</w:t>
+      </w:r>
+    </w:p>
+    <w:p>
+      <w:r>
+        <w:t xml:space="preserve">  '</w:t>
+      </w:r>
+      <w:r>
+        <w:t>Usuario interno</w:t>
+      </w:r>
+      <w:r>
+        <w:t>',</w:t>
+      </w:r>
+    </w:p>
+    <w:p>
+      <w:pPr>
+        <w:rPr>
+          <w:lang w:val="en-US"/>
+        </w:rPr>
+      </w:pPr>
+      <w:r>
+        <w:t xml:space="preserve">  </w:t>
+      </w:r>
+      <w:r>
+        <w:rPr>
+          <w:lang w:val="en-US"/>
+        </w:rPr>
+        <w:t>'</w:t>
+      </w:r>
+      <w:r>
+        <w:rPr>
+          <w:lang w:val="en-US"/>
+        </w:rPr>
+        <w:t>interno</w:t>
+      </w:r>
+      <w:r>
+        <w:rPr>
+          <w:lang w:val="en-US"/>
+        </w:rPr>
+        <w:t>',</w:t>
+      </w:r>
+    </w:p>
+    <w:p>
+      <w:pPr>
+        <w:rPr>
+          <w:lang w:val="en-US"/>
+        </w:rPr>
+      </w:pPr>
+      <w:r>
+        <w:rPr>
+          <w:lang w:val="en-US"/>
+        </w:rPr>
+        <w:t xml:space="preserve">  true,</w:t>
+      </w:r>
+    </w:p>
+    <w:p>
+      <w:pPr>
+        <w:rPr>
+          <w:lang w:val="en-US"/>
+        </w:rPr>
+      </w:pPr>
+      <w:r>
+        <w:rPr>
+          <w:lang w:val="en-US"/>
+        </w:rPr>
+        <w:t xml:space="preserve">  now(),</w:t>
+      </w:r>
+    </w:p>
+    <w:p>
+      <w:pPr>
+        <w:rPr>
+          <w:lang w:val="en-US"/>
+        </w:rPr>
+      </w:pPr>
+      <w:r>
+        <w:rPr>
+          <w:lang w:val="en-US"/>
+        </w:rPr>
+        <w:t xml:space="preserve">  '{}',</w:t>
+      </w:r>
+    </w:p>
+    <w:p>
+      <w:pPr>
+        <w:rPr>
+          <w:lang w:val="en-US"/>
+        </w:rPr>
+      </w:pPr>
+      <w:r>
+        <w:rPr>
+          <w:lang w:val="en-US"/>
+        </w:rPr>
+        <w:t xml:space="preserve">  'PROMOCIMA'</w:t>
+      </w:r>
+    </w:p>
+    <w:p>
+      <w:pPr>
+        <w:rPr>
+          <w:lang w:val="en-US"/>
+        </w:rPr>
+      </w:pPr>
+      <w:r>
+        <w:rPr>
+          <w:lang w:val="en-US"/>
+        </w:rPr>
+        <w:t>);</w:t>
+      </w:r>
+    </w:p>
+    <w:p>
+      <w:pPr>
+        <w:rPr>
+          <w:lang w:val="en-US"/>
+        </w:rPr>
+      </w:pPr>
+    </w:p>
+    <w:p>
+      <w:pPr>
+        <w:rPr>
+          <w:lang w:val="en-US"/>
+        </w:rPr>
+      </w:pPr>
+    </w:p>
+    <w:p>
+      <w:pPr>
+        <w:rPr>
+          <w:lang w:val="en-US"/>
+        </w:rPr>
+      </w:pPr>
+      <w:r>
+        <w:rPr>
+          <w:lang w:val="en-US"/>
+        </w:rPr>
+        <w:t>INSERT INTO public.perfiles (id, email, nombre, rol, activo, created_at, participe_ids, empresa_id)</w:t>
+      </w:r>
+    </w:p>
+    <w:p>
+      <w:pPr>
+        <w:rPr>
+          <w:lang w:val="en-US"/>
+        </w:rPr>
+      </w:pPr>
+      <w:r>
+        <w:rPr>
+          <w:lang w:val="en-US"/>
+        </w:rPr>
+        <w:t>VALUES (</w:t>
+      </w:r>
+    </w:p>
+    <w:p>
+      <w:r>
+        <w:t xml:space="preserve">  '</w:t>
+      </w:r>
+      <w:r>
+        <w:t>id_user_</w:t>
+      </w:r>
+      <w:r>
+        <w:t>perticipe</w:t>
+      </w:r>
+      <w:r>
+        <w:t>',</w:t>
+      </w:r>
+    </w:p>
+    <w:p>
+      <w:r>
+        <w:t xml:space="preserve">  '</w:t>
+      </w:r>
+      <w:r>
+        <w:t>participe</w:t>
+      </w:r>
+      <w:r>
+        <w:t>@promocima.com',</w:t>
+      </w:r>
+    </w:p>
+    <w:p>
+      <w:r>
+        <w:t xml:space="preserve">  '</w:t>
+      </w:r>
+      <w:r>
+        <w:t>Usuario Partícipe</w:t>
+      </w:r>
+      <w:r>
+        <w:t>',</w:t>
+      </w:r>
+    </w:p>
+    <w:p>
+      <w:pPr>
+        <w:rPr>
+          <w:lang w:val="en-US"/>
+        </w:rPr>
+      </w:pPr>
+      <w:r>
+        <w:t xml:space="preserve">  </w:t>
+      </w:r>
+      <w:r>
+        <w:rPr>
+          <w:lang w:val="en-US"/>
+        </w:rPr>
+        <w:t>'</w:t>
+      </w:r>
+      <w:r>
+        <w:rPr>
+          <w:lang w:val="en-US"/>
+        </w:rPr>
+        <w:t>participe</w:t>
+      </w:r>
+      <w:r>
+        <w:rPr>
+          <w:lang w:val="en-US"/>
+        </w:rPr>
+        <w:t>',</w:t>
+      </w:r>
+    </w:p>
+    <w:p>
+      <w:pPr>
+        <w:rPr>
+          <w:lang w:val="en-US"/>
+        </w:rPr>
+      </w:pPr>
+      <w:r>
+        <w:rPr>
+          <w:lang w:val="en-US"/>
+        </w:rPr>
+        <w:t xml:space="preserve">  true,</w:t>
+      </w:r>
+    </w:p>
+    <w:p>
+      <w:pPr>
+        <w:rPr>
+          <w:lang w:val="en-US"/>
+        </w:rPr>
+      </w:pPr>
+      <w:r>
+        <w:rPr>
+          <w:lang w:val="en-US"/>
+        </w:rPr>
+        <w:t xml:space="preserve">  now(),</w:t>
+      </w:r>
+    </w:p>
+    <w:p>
+      <w:pPr>
+        <w:rPr>
+          <w:lang w:val="en-US"/>
+        </w:rPr>
+      </w:pPr>
+      <w:r>
+        <w:rPr>
+          <w:lang w:val="en-US"/>
+        </w:rPr>
+        <w:t xml:space="preserve">  '{}',</w:t>
+      </w:r>
+    </w:p>
+    <w:p>
+      <w:pPr>
+        <w:rPr>
+          <w:lang w:val="en-US"/>
+        </w:rPr>
+      </w:pPr>
+      <w:r>
+        <w:rPr>
+          <w:lang w:val="en-US"/>
+        </w:rPr>
+        <w:t xml:space="preserve">  'PROMOCIMA'</w:t>
+      </w:r>
+    </w:p>
+    <w:p>
+      <w:pPr>
+        <w:rPr>
+          <w:lang w:val="en-US"/>
+        </w:rPr>
+      </w:pPr>
+      <w:r>
+        <w:rPr>
+          <w:lang w:val="en-US"/>
+        </w:rPr>
+        <w:t>);</w:t>
+      </w:r>
+    </w:p>
+    <w:p>
+      <w:pPr>
+        <w:rPr>
+          <w:lang w:val="en-US"/>
+        </w:rPr>
+      </w:pPr>
+    </w:p>
+    <w:p>
+      <w:pPr>
+        <w:rPr>
+          <w:lang w:val="en-US"/>
+        </w:rPr>
+      </w:pPr>
+      <w:r>
+        <w:rPr>
+          <w:lang w:val="en-US"/>
+        </w:rPr>
+        <w:t>INSERT INTO public.perfiles (id, email, nombre, rol, activo, created_at, participe_ids, empresa_id)</w:t>
+      </w:r>
+    </w:p>
+    <w:p>
+      <w:pPr>
+        <w:rPr>
+          <w:lang w:val="en-US"/>
+        </w:rPr>
+      </w:pPr>
+      <w:r>
+        <w:rPr>
+          <w:lang w:val="en-US"/>
+        </w:rPr>
+        <w:t>VALUES (</w:t>
+      </w:r>
+    </w:p>
+    <w:p>
+      <w:pPr>
+        <w:rPr>
+          <w:lang w:val="en-US"/>
+        </w:rPr>
+      </w:pPr>
+      <w:r>
+        <w:rPr>
+          <w:lang w:val="en-US"/>
+        </w:rPr>
+        <w:t xml:space="preserve">  '</w:t>
+      </w:r>
+      <w:r>
+        <w:rPr>
+          <w:lang w:val="en-US"/>
+        </w:rPr>
+        <w:t xml:space="preserve"> </w:t>
+      </w:r>
+      <w:r>
+        <w:rPr>
+          <w:lang w:val="en-US"/>
+        </w:rPr>
+        <w:t>id_user_</w:t>
+      </w:r>
+      <w:r>
+        <w:rPr>
+          <w:lang w:val="en-US"/>
+        </w:rPr>
+        <w:t>t_admin</w:t>
+      </w:r>
+      <w:r>
+        <w:rPr>
+          <w:lang w:val="en-US"/>
+        </w:rPr>
+        <w:t>',</w:t>
+      </w:r>
+    </w:p>
+    <w:p>
+      <w:r>
+        <w:rPr>
+          <w:lang w:val="en-US"/>
+        </w:rPr>
+        <w:t xml:space="preserve">  </w:t>
+      </w:r>
+      <w:r>
+        <w:t>'t_admin@promocima.com',</w:t>
+      </w:r>
+    </w:p>
+    <w:p>
+      <w:r>
+        <w:t xml:space="preserve">  'Admin pruebas',</w:t>
+      </w:r>
+    </w:p>
+    <w:p>
+      <w:pPr>
+        <w:rPr>
+          <w:lang w:val="en-US"/>
+        </w:rPr>
+      </w:pPr>
+      <w:r>
+        <w:t xml:space="preserve">  </w:t>
+      </w:r>
+      <w:r>
+        <w:rPr>
+          <w:lang w:val="en-US"/>
+        </w:rPr>
+        <w:t>'admin',</w:t>
+      </w:r>
+    </w:p>
+    <w:p>
+      <w:pPr>
+        <w:rPr>
+          <w:lang w:val="en-US"/>
+        </w:rPr>
+      </w:pPr>
+      <w:r>
+        <w:rPr>
+          <w:lang w:val="en-US"/>
+        </w:rPr>
+        <w:t xml:space="preserve">  true,</w:t>
+      </w:r>
+    </w:p>
+    <w:p>
+      <w:pPr>
+        <w:rPr>
+          <w:lang w:val="en-US"/>
+        </w:rPr>
+      </w:pPr>
+      <w:r>
+        <w:rPr>
+          <w:lang w:val="en-US"/>
+        </w:rPr>
+        <w:t xml:space="preserve">  now(),</w:t>
+      </w:r>
+    </w:p>
+    <w:p>
+      <w:pPr>
+        <w:rPr>
+          <w:lang w:val="en-US"/>
+        </w:rPr>
+      </w:pPr>
+      <w:r>
+        <w:rPr>
+          <w:lang w:val="en-US"/>
+        </w:rPr>
+        <w:t xml:space="preserve">  '{}',</w:t>
+      </w:r>
+    </w:p>
+    <w:p>
+      <w:r>
+        <w:rPr>
+          <w:lang w:val="en-US"/>
+        </w:rPr>
+        <w:t xml:space="preserve">  </w:t>
+      </w:r>
+      <w:r>
+        <w:t>'PRUEBAS'</w:t>
+      </w:r>
+    </w:p>
+    <w:p>
+      <w:r>
+        <w:t>);</w:t>
+      </w:r>
+    </w:p>
+    <w:p/>
+    <w:p>
+      <w:pPr>
+        <w:rPr>
+          <w:lang w:val="en-US"/>
+        </w:rPr>
+      </w:pPr>
+      <w:r>
+        <w:rPr>
+          <w:lang w:val="en-US"/>
+        </w:rPr>
+        <w:t>INSERT INTO public.perfiles (id, email, nombre, rol, activo, created_at, participe_ids, empresa_id)</w:t>
+      </w:r>
+    </w:p>
+    <w:p>
+      <w:pPr>
+        <w:rPr>
+          <w:lang w:val="en-US"/>
+        </w:rPr>
+      </w:pPr>
+      <w:r>
+        <w:rPr>
+          <w:lang w:val="en-US"/>
+        </w:rPr>
+        <w:t>VALUES (</w:t>
+      </w:r>
+    </w:p>
+    <w:p>
+      <w:pPr>
+        <w:rPr>
+          <w:lang w:val="en-US"/>
+        </w:rPr>
+      </w:pPr>
+      <w:r>
+        <w:rPr>
+          <w:lang w:val="en-US"/>
+        </w:rPr>
+        <w:t xml:space="preserve">  ' id_user_t_</w:t>
+      </w:r>
+      <w:r>
+        <w:rPr>
+          <w:lang w:val="en-US"/>
+        </w:rPr>
+        <w:t>interno</w:t>
+      </w:r>
+      <w:r>
+        <w:rPr>
+          <w:lang w:val="en-US"/>
+        </w:rPr>
+        <w:t>',</w:t>
+      </w:r>
+    </w:p>
+    <w:p>
+      <w:r>
+        <w:rPr>
+          <w:lang w:val="en-US"/>
+        </w:rPr>
+        <w:t xml:space="preserve">  </w:t>
+      </w:r>
+      <w:r>
+        <w:t>'t_interno@promocima.com',</w:t>
+      </w:r>
+    </w:p>
+    <w:p>
+      <w:r>
+        <w:t xml:space="preserve">  'Usuario interno pruebas',</w:t>
+      </w:r>
+    </w:p>
+    <w:p>
+      <w:pPr>
+        <w:rPr>
+          <w:lang w:val="en-US"/>
+        </w:rPr>
+      </w:pPr>
+      <w:r>
+        <w:t xml:space="preserve">  </w:t>
+      </w:r>
+      <w:r>
+        <w:rPr>
+          <w:lang w:val="en-US"/>
+        </w:rPr>
+        <w:t>'interno',</w:t>
+      </w:r>
+    </w:p>
+    <w:p>
+      <w:pPr>
+        <w:rPr>
+          <w:lang w:val="en-US"/>
+        </w:rPr>
+      </w:pPr>
+      <w:r>
+        <w:rPr>
+          <w:lang w:val="en-US"/>
+        </w:rPr>
+        <w:t xml:space="preserve">  true,</w:t>
+      </w:r>
+    </w:p>
+    <w:p>
+      <w:pPr>
+        <w:rPr>
+          <w:lang w:val="en-US"/>
+        </w:rPr>
+      </w:pPr>
+      <w:r>
+        <w:rPr>
+          <w:lang w:val="en-US"/>
+        </w:rPr>
+        <w:t xml:space="preserve">  now(),</w:t>
+      </w:r>
+    </w:p>
+    <w:p>
+      <w:pPr>
+        <w:rPr>
+          <w:lang w:val="en-US"/>
+        </w:rPr>
+      </w:pPr>
+      <w:r>
+        <w:rPr>
+          <w:lang w:val="en-US"/>
+        </w:rPr>
+        <w:lastRenderedPageBreak/>
+        <w:t xml:space="preserve">  '{}',</w:t>
+      </w:r>
+    </w:p>
+    <w:p>
+      <w:pPr>
+        <w:rPr>
+          <w:lang w:val="en-US"/>
+        </w:rPr>
+      </w:pPr>
+      <w:r>
+        <w:rPr>
+          <w:lang w:val="en-US"/>
+        </w:rPr>
+        <w:t xml:space="preserve">  'PRUEBAS'</w:t>
+      </w:r>
+    </w:p>
+    <w:p>
+      <w:pPr>
+        <w:rPr>
+          <w:lang w:val="en-US"/>
+        </w:rPr>
+      </w:pPr>
+      <w:r>
+        <w:rPr>
+          <w:lang w:val="en-US"/>
+        </w:rPr>
+        <w:t>);</w:t>
+      </w:r>
+    </w:p>
+    <w:p>
+      <w:pPr>
+        <w:rPr>
+          <w:lang w:val="en-US"/>
+        </w:rPr>
+      </w:pPr>
+    </w:p>
+    <w:p>
+      <w:pPr>
+        <w:rPr>
+          <w:lang w:val="en-US"/>
+        </w:rPr>
+      </w:pPr>
+      <w:r>
+        <w:rPr>
+          <w:lang w:val="en-US"/>
+        </w:rPr>
+        <w:t>INSERT INTO public.perfiles (id, email, nombre, rol, activo, created_at, participe_ids, empresa_id)</w:t>
+      </w:r>
+    </w:p>
+    <w:p>
+      <w:pPr>
+        <w:rPr>
+          <w:lang w:val="en-US"/>
+        </w:rPr>
+      </w:pPr>
+      <w:r>
+        <w:rPr>
+          <w:lang w:val="en-US"/>
+        </w:rPr>
+        <w:t>VALUES (</w:t>
+      </w:r>
+    </w:p>
+    <w:p>
+      <w:pPr>
+        <w:rPr>
+          <w:lang w:val="en-US"/>
+        </w:rPr>
+      </w:pPr>
+      <w:r>
+        <w:rPr>
+          <w:lang w:val="en-US"/>
+        </w:rPr>
+        <w:t xml:space="preserve">  ' id_user_t_</w:t>
+      </w:r>
+      <w:r>
+        <w:rPr>
+          <w:lang w:val="en-US"/>
+        </w:rPr>
+        <w:t>participe</w:t>
+      </w:r>
+      <w:r>
+        <w:rPr>
+          <w:lang w:val="en-US"/>
+        </w:rPr>
+        <w:t>',</w:t>
+      </w:r>
+    </w:p>
+    <w:p>
+      <w:r>
+        <w:rPr>
+          <w:lang w:val="en-US"/>
+        </w:rPr>
+        <w:t xml:space="preserve">  </w:t>
+      </w:r>
+      <w:r>
+        <w:t>'t_participe@promocima.com',</w:t>
+      </w:r>
+    </w:p>
+    <w:p>
+      <w:r>
+        <w:t xml:space="preserve">  'Usuario Partícipe pruebas',</w:t>
+      </w:r>
+    </w:p>
+    <w:p>
+      <w:pPr>
+        <w:rPr>
+          <w:lang w:val="en-US"/>
+        </w:rPr>
+      </w:pPr>
+      <w:r>
+        <w:t xml:space="preserve">  </w:t>
+      </w:r>
+      <w:r>
+        <w:rPr>
+          <w:lang w:val="en-US"/>
+        </w:rPr>
+        <w:t>'participe',</w:t>
+      </w:r>
+    </w:p>
+    <w:p>
+      <w:pPr>
+        <w:rPr>
+          <w:lang w:val="en-US"/>
+        </w:rPr>
+      </w:pPr>
+      <w:r>
+        <w:rPr>
+          <w:lang w:val="en-US"/>
+        </w:rPr>
+        <w:t xml:space="preserve">  true,</w:t>
+      </w:r>
+    </w:p>
+    <w:p>
+      <w:pPr>
+        <w:rPr>
+          <w:lang w:val="en-US"/>
+        </w:rPr>
+      </w:pPr>
+      <w:r>
+        <w:rPr>
+          <w:lang w:val="en-US"/>
+        </w:rPr>
+        <w:t xml:space="preserve">  now(),</w:t>
+      </w:r>
+    </w:p>
+    <w:p>
+      <w:pPr>
+        <w:rPr>
+          <w:lang w:val="en-US"/>
+        </w:rPr>
+      </w:pPr>
+      <w:r>
+        <w:rPr>
+          <w:lang w:val="en-US"/>
+        </w:rPr>
+        <w:t xml:space="preserve">  '{}',</w:t>
+      </w:r>
+    </w:p>
+    <w:p>
+      <w:r>
+        <w:rPr>
+          <w:lang w:val="en-US"/>
+        </w:rPr>
+        <w:t xml:space="preserve">  </w:t>
+      </w:r>
+      <w:r>
+        <w:t>'PRUEBAS'</w:t>
+      </w:r>
+    </w:p>
+    <w:p>
+      <w:r>
+        <w:t>);</w:t>
+      </w:r>
+    </w:p>
+    <w:p>
+      <w:pPr>
+        <w:rPr>
+          <w:lang w:val="en-US"/>
+        </w:rPr>
+      </w:pPr>
     </w:p>
     <w:p>
       <w:pPr>
@@ -258,51 +1155,45 @@
         <w:rPr>
           <w:lang w:val="en-US"/>
         </w:rPr>
-        <w:t>VERCEL_OIDC_TOKEN="eyJhbGciOiJSUzI1NiIsInR5cCI6IkpXVCIsImtpZCI6Im1yay00MzAyZWMxYjY3MGY0OGE5OGFkNjFkYWRlNGEyM2JlNyJ9.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</w:t>
-      </w:r>
-      <w:r>
-        <w:rPr>
-          <w:lang w:val="en-US"/>
-        </w:rPr>
+        <w:t>VERCEL_OIDC_TOKEN="eyJhbGciOiJSUzI1NiIsInR5cCI6IkpXVCIsImtpZCI6Im1yay00MzAyZWMxYjY3MGY0OGE5OGFkNjFkYWRlNGEyM2JlNyJ9.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.KBT2wGkWpLixbKGR2LDfiKTbTwgR5Yo1HIJTe57KGTFhUasD_LETfxI-ufgV_T5EVxxpEyPIyosDQw7gZJW2gvVULB0z6Eoq9Rv-khFOdGYSCqUsktnKwk797u2uIzQGYjG4Zh0sAtWA2yNlkBNgew_EidkX6gbE1rr6qAGMf7OsPMPm71_2LcJtB2GsMC9FoNLMAOfo5CbAmGGpebTRy3FXoM3429wuU3dShgJdyyJhLfr4T319eYny4lCnUwzWqgWh0c9DfyiaxfP2bFZgxfGCdMdKqKJZatx69Um_k6pPehjnX7jmwEm-kfrD3hqLRuRz-jx8CgDv6NotTi0DPw"</w:t>
+      </w:r>
+    </w:p>
+    <w:p>
+      <w:pPr>
+        <w:rPr>
+          <w:lang w:val="en-US"/>
+        </w:rPr>
+      </w:pPr>
+    </w:p>
+    <w:p>
+      <w:r>
+        <w:t># ================== IMPORTANTE ==========================</w:t>
+      </w:r>
+    </w:p>
+    <w:p>
+      <w:r>
+        <w:t># SI SE CAMBIA ESTE FICHERO:</w:t>
+      </w:r>
+    </w:p>
+    <w:p>
+      <w:r>
+        <w:t># CTRL-C</w:t>
+      </w:r>
+    </w:p>
+    <w:p>
+      <w:r>
+        <w:t># EJECUTAR: npm run dev</w:t>
+      </w:r>
+    </w:p>
+    <w:p/>
+    <w:p>
+      <w:r>
+        <w:t># ── BD PRUEBAS ──────────────────────────</w:t>
+      </w:r>
+    </w:p>
+    <w:p>
+      <w:r>
         <w:lastRenderedPageBreak/>
-        <w:t>zMyNDEwNDYsImV4cCI6MTc3MzI4NDI0Nn0.KBT2wGkWpLixbKGR2LDfiKTbTwgR5Yo1HIJTe57KGTFhUasD_LETfxI-ufgV_T5EVxxpEyPIyosDQw7gZJW2gvVULB0z6Eoq9Rv-khFOdGYSCqUsktnKwk797u2uIzQGYjG4Zh0sAtWA2yNlkBNgew_EidkX6gbE1rr6qAGMf7OsPMPm71_2LcJtB2GsMC9FoNLMAOfo5CbAmGGpebTRy3FXoM3429wuU3dShgJdyyJhLfr4T319eYny4lCnUwzWqgWh0c9DfyiaxfP2bFZgxfGCdMdKqKJZatx69Um_k6pPehjnX7jmwEm-kfrD3hqLRuRz-jx8CgDv6NotTi0DPw"</w:t>
-      </w:r>
-    </w:p>
-    <w:p>
-      <w:pPr>
-        <w:rPr>
-          <w:lang w:val="en-US"/>
-        </w:rPr>
-      </w:pPr>
-    </w:p>
-    <w:p>
-      <w:r>
-        <w:t># ================== IMPORTANTE ==========================</w:t>
-      </w:r>
-    </w:p>
-    <w:p>
-      <w:r>
-        <w:t># SI SE CAMBIA ESTE FICHERO:</w:t>
-      </w:r>
-    </w:p>
-    <w:p>
-      <w:r>
-        <w:t># CTRL-C</w:t>
-      </w:r>
-    </w:p>
-    <w:p>
-      <w:r>
-        <w:t># EJECUTAR: npm run dev</w:t>
-      </w:r>
-    </w:p>
-    <w:p/>
-    <w:p>
-      <w:r>
-        <w:t># ── BD PRUEBAS ──────────────────────────</w:t>
-      </w:r>
-    </w:p>
-    <w:p>
-      <w:r>
         <w:t># VITE_ENTORNO=PRUEBAS</w:t>
       </w:r>
     </w:p>
@@ -347,7 +1238,15 @@
       </w:r>
     </w:p>
     <w:p>
-      <w:r>
+      <w:pPr>
+        <w:rPr>
+          <w:lang w:val="en-US"/>
+        </w:rPr>
+      </w:pPr>
+      <w:r>
+        <w:rPr>
+          <w:lang w:val="en-US"/>
+        </w:rPr>
         <w:t>VITE_SUPABASE_ANON_KEY=sb_publishable_iSKDV79oprAZD4aYhYo4Jw_E61th6T3</w:t>
       </w:r>
     </w:p>

</xml_diff>